<commit_message>
PCOS proposal: final title
Co-Authored-By: Claude Fable 5.1 <noreply@anthropic.com>
</commit_message>
<xml_diff>
--- a/PCOS_Repurposing_Proposal.docx
+++ b/PCOS_Repurposing_Proposal.docx
@@ -330,13 +330,13 @@
       </w:r>
     </w:p>
     <w:bookmarkEnd w:id="20"/>
-    <w:bookmarkStart w:id="29" w:name="Xe6f5b3d009c19fe9a2ea7fba0b94676de3168d8"/>
+    <w:bookmarkStart w:id="29" w:name="Xf1ddead9a863d9d487633384e54056e2068e42c"/>
     <w:p>
       <w:pPr>
         <w:pStyle w:val="Heading1"/>
       </w:pPr>
       <w:r>
-        <w:t xml:space="preserve">Ranking approved drugs for polycystic ovary syndrome by network proximity analysis of drug-target and protein-interaction data using Apache Spark</w:t>
+        <w:t xml:space="preserve">Identification of Drug Repurposing Candidates for Polycystic Ovary Syndrome Using Drug–Target Interaction Data</w:t>
       </w:r>
     </w:p>
     <w:bookmarkStart w:id="21" w:name="the-biological-problem"/>

</xml_diff>